<commit_message>
Cập nhật mẫu Word cầu trục lên v11: chỉnh bảng chữ ký cuối trang
Thay public/report-templates/thiet-bi-nang-cau-truc.docx bằng nội dung
mau-bien-ban/BBKD-Thiet-bi-nang-kieu-cau-DRAFT-v11.docx. Thay đổi duy
nhất là layout bảng chữ ký (bỏ dòng trống đệm phía trên "(Ký, ghi rõ họ
tên...)", tên người chứng kiến/kiểm định viên cách 1 khoảng vừa đủ ký
tay) -- đã đối chiếu text/tag giữa file cũ và v11 giống hệt 100% (diff
plain text sau khi strip XML), không đổi tag hay logic nào trong
src/lib/reports/. Đã parse thử bằng docxtemplater xác nhận file mới
không lỗi cú pháp. Không cần migration.

Co-Authored-By: Claude Sonnet 5 <noreply@anthropic.com>
</commit_message>
<xml_diff>
--- a/public/report-templates/thiet-bi-nang-cau-truc.docx
+++ b/public/report-templates/thiet-bi-nang-cau-truc.docx
@@ -6826,7 +6826,7 @@
                 <w:sz w:val="20"/>
                 <w:szCs w:val="20"/>
               </w:rPr>
-              <w:t xml:space="preserve"/>
+              <w:t xml:space="preserve">(Ký, ghi rõ họ tên)</w:t>
             </w:r>
           </w:p>
           <w:p>
@@ -6860,7 +6860,7 @@
                 <w:sz w:val="20"/>
                 <w:szCs w:val="20"/>
               </w:rPr>
-              <w:t xml:space="preserve">(Ký, ghi rõ họ tên)</w:t>
+              <w:t xml:space="preserve"/>
             </w:r>
           </w:p>
           <w:p>
@@ -6877,7 +6877,7 @@
                 <w:sz w:val="20"/>
                 <w:szCs w:val="20"/>
               </w:rPr>
-              <w:t xml:space="preserve"/>
+              <w:t xml:space="preserve">{#chung_kien}</w:t>
             </w:r>
           </w:p>
           <w:p>
@@ -6894,7 +6894,7 @@
                 <w:sz w:val="20"/>
                 <w:szCs w:val="20"/>
               </w:rPr>
-              <w:t xml:space="preserve"/>
+              <w:t xml:space="preserve">{ten}</w:t>
             </w:r>
           </w:p>
           <w:p>
@@ -6911,40 +6911,6 @@
                 <w:sz w:val="20"/>
                 <w:szCs w:val="20"/>
               </w:rPr>
-              <w:t xml:space="preserve">{#chung_kien}</w:t>
-            </w:r>
-          </w:p>
-          <w:p>
-            <w:pPr>
-              <w:jc w:val="center"/>
-            </w:pPr>
-            <w:r>
-              <w:rPr>
-                <w:rFonts w:ascii="Times New Roman" w:cs="Times New Roman" w:eastAsia="Times New Roman" w:hAnsi="Times New Roman"/>
-                <w:b w:val="false"/>
-                <w:bCs w:val="false"/>
-                <w:i/>
-                <w:iCs/>
-                <w:sz w:val="20"/>
-                <w:szCs w:val="20"/>
-              </w:rPr>
-              <w:t xml:space="preserve">{ten}</w:t>
-            </w:r>
-          </w:p>
-          <w:p>
-            <w:pPr>
-              <w:jc w:val="center"/>
-            </w:pPr>
-            <w:r>
-              <w:rPr>
-                <w:rFonts w:ascii="Times New Roman" w:cs="Times New Roman" w:eastAsia="Times New Roman" w:hAnsi="Times New Roman"/>
-                <w:b w:val="false"/>
-                <w:bCs w:val="false"/>
-                <w:i/>
-                <w:iCs/>
-                <w:sz w:val="20"/>
-                <w:szCs w:val="20"/>
-              </w:rPr>
               <w:t xml:space="preserve">{/chung_kien}</w:t>
             </w:r>
           </w:p>
@@ -6981,40 +6947,6 @@
                 <w:szCs w:val="20"/>
               </w:rPr>
               <w:t xml:space="preserve">KIỂM ĐỊNH VIÊN</w:t>
-            </w:r>
-          </w:p>
-          <w:p>
-            <w:pPr>
-              <w:jc w:val="center"/>
-            </w:pPr>
-            <w:r>
-              <w:rPr>
-                <w:rFonts w:ascii="Times New Roman" w:cs="Times New Roman" w:eastAsia="Times New Roman" w:hAnsi="Times New Roman"/>
-                <w:b w:val="false"/>
-                <w:bCs w:val="false"/>
-                <w:i/>
-                <w:iCs/>
-                <w:sz w:val="20"/>
-                <w:szCs w:val="20"/>
-              </w:rPr>
-              <w:t xml:space="preserve"/>
-            </w:r>
-          </w:p>
-          <w:p>
-            <w:pPr>
-              <w:jc w:val="center"/>
-            </w:pPr>
-            <w:r>
-              <w:rPr>
-                <w:rFonts w:ascii="Times New Roman" w:cs="Times New Roman" w:eastAsia="Times New Roman" w:hAnsi="Times New Roman"/>
-                <w:b w:val="false"/>
-                <w:bCs w:val="false"/>
-                <w:i/>
-                <w:iCs/>
-                <w:sz w:val="20"/>
-                <w:szCs w:val="20"/>
-              </w:rPr>
-              <w:t xml:space="preserve"/>
             </w:r>
           </w:p>
           <w:p>

</xml_diff>